<commit_message>
Fix ERD PK-FK labels, fix SQL text bug, add references to all docs
</commit_message>
<xml_diff>
--- a/docs/API-Endpoint-Plan.docx
+++ b/docs/API-Endpoint-Plan.docx
@@ -3817,6 +3817,38 @@
       </w:pPr>
       <w:r>
         <w:t xml:space="preserve">- Error responses include a message that explains what went wrong so the front-end can show it to the user.</w:t>
+      </w:r>
+    </w:p>
+    <w:p>
+      <w:pPr>
+        <w:pStyle w:val="Heading2"/>
+      </w:pPr>
+      <w:r>
+        <w:t xml:space="preserve">References</w:t>
+      </w:r>
+    </w:p>
+    <w:p>
+      <w:pPr>
+        <w:spacing w:after="120"/>
+      </w:pPr>
+      <w:r>
+        <w:t xml:space="preserve">Microsoft (2026) ASP.NET Core web API documentation. Available at: https://learn.microsoft.com/en-us/aspnet/core/web-api/</w:t>
+      </w:r>
+    </w:p>
+    <w:p>
+      <w:pPr>
+        <w:spacing w:after="120"/>
+      </w:pPr>
+      <w:r>
+        <w:t xml:space="preserve">Microsoft (2026) JWT bearer authentication in ASP.NET Core. Available at: https://learn.microsoft.com/en-us/aspnet/core/security/authentication/</w:t>
+      </w:r>
+    </w:p>
+    <w:p>
+      <w:pPr>
+        <w:spacing w:after="200"/>
+      </w:pPr>
+      <w:r>
+        <w:t xml:space="preserve">Fielding, R. (2000) Architectural Styles and the Design of Network-based Software Architectures. PhD thesis. University of California, Irvine.</w:t>
       </w:r>
     </w:p>
     <w:p>

</xml_diff>

<commit_message>
Add missing endpoints, session wording and event distance/type to plan, ERD and SQL script
</commit_message>
<xml_diff>
--- a/docs/API-Endpoint-Plan.docx
+++ b/docs/API-Endpoint-Plan.docx
@@ -568,7 +568,7 @@
                 <w:sz w:val="18"/>
                 <w:szCs w:val="18"/>
               </w:rPr>
-              <w:t xml:space="preserve">Signs the user in and returns a JWT token they use for authenticated requests.</w:t>
+              <w:t xml:space="preserve">Signs the user in. The server creates a session that stores the user's ID and role, and sends back a session cookie that the client uses for authenticated requests.</w:t>
             </w:r>
           </w:p>
         </w:tc>
@@ -658,7 +658,7 @@
                 <w:sz w:val="18"/>
                 <w:szCs w:val="18"/>
               </w:rPr>
-              <w:t xml:space="preserve">200 OK - returns a JWT token and user info. 401 Unauthorized - if email or password is wrong.</w:t>
+              <w:t xml:space="preserve">200 OK - starts the session and returns the user's ID, name and role. 401 Unauthorized - if email or password is wrong.</w:t>
             </w:r>
           </w:p>
         </w:tc>
@@ -690,7 +690,7 @@
                 <w:sz w:val="18"/>
                 <w:szCs w:val="18"/>
               </w:rPr>
-              <w:t xml:space="preserve">GET</w:t>
+              <w:t xml:space="preserve">POST</w:t>
             </w:r>
           </w:p>
         </w:tc>
@@ -720,7 +720,7 @@
                 <w:sz w:val="18"/>
                 <w:szCs w:val="18"/>
               </w:rPr>
-              <w:t xml:space="preserve">/api/users/profile</w:t>
+              <w:t xml:space="preserve">/api/auth/logout</w:t>
             </w:r>
           </w:p>
         </w:tc>
@@ -750,7 +750,7 @@
                 <w:sz w:val="18"/>
                 <w:szCs w:val="18"/>
               </w:rPr>
-              <w:t xml:space="preserve">Gets the profile of the user who is currently logged in.</w:t>
+              <w:t xml:space="preserve">Signs the user out by clearing their session on the server.</w:t>
             </w:r>
           </w:p>
         </w:tc>
@@ -840,7 +840,7 @@
                 <w:sz w:val="18"/>
                 <w:szCs w:val="18"/>
               </w:rPr>
-              <w:t xml:space="preserve">200 OK - returns the user's name, email, role, and date joined. 401 Unauthorized - if no valid token.</w:t>
+              <w:t xml:space="preserve">200 OK - session cleared. 401 Unauthorized - if the user is not logged in.</w:t>
             </w:r>
           </w:p>
         </w:tc>
@@ -872,7 +872,7 @@
                 <w:sz w:val="18"/>
                 <w:szCs w:val="18"/>
               </w:rPr>
-              <w:t xml:space="preserve">PUT</w:t>
+              <w:t xml:space="preserve">GET</w:t>
             </w:r>
           </w:p>
         </w:tc>
@@ -932,7 +932,7 @@
                 <w:sz w:val="18"/>
                 <w:szCs w:val="18"/>
               </w:rPr>
-              <w:t xml:space="preserve">Lets the user update their name and email.</w:t>
+              <w:t xml:space="preserve">Gets the profile of the user who is currently logged in.</w:t>
             </w:r>
           </w:p>
         </w:tc>
@@ -992,7 +992,7 @@
                 <w:sz w:val="18"/>
                 <w:szCs w:val="18"/>
               </w:rPr>
-              <w:t xml:space="preserve">{ "fullName": "string", "email": "string" }</w:t>
+              <w:t xml:space="preserve">None</w:t>
             </w:r>
           </w:p>
         </w:tc>
@@ -1022,7 +1022,7 @@
                 <w:sz w:val="18"/>
                 <w:szCs w:val="18"/>
               </w:rPr>
-              <w:t xml:space="preserve">200 OK - returns updated profile. 400 Bad Request - if the new email is already taken. 401 Unauthorized - if not logged in.</w:t>
+              <w:t xml:space="preserve">200 OK - returns the user's name, email, role, and date joined. 401 Unauthorized - if not logged in.</w:t>
             </w:r>
           </w:p>
         </w:tc>
@@ -1054,7 +1054,7 @@
                 <w:sz w:val="18"/>
                 <w:szCs w:val="18"/>
               </w:rPr>
-              <w:t xml:space="preserve">GET</w:t>
+              <w:t xml:space="preserve">PUT</w:t>
             </w:r>
           </w:p>
         </w:tc>
@@ -1084,7 +1084,7 @@
                 <w:sz w:val="18"/>
                 <w:szCs w:val="18"/>
               </w:rPr>
-              <w:t xml:space="preserve">/api/events</w:t>
+              <w:t xml:space="preserve">/api/users/profile</w:t>
             </w:r>
           </w:p>
         </w:tc>
@@ -1114,7 +1114,7 @@
                 <w:sz w:val="18"/>
                 <w:szCs w:val="18"/>
               </w:rPr>
-              <w:t xml:space="preserve">Returns a list of all active events. Anyone can see what events are coming up.</w:t>
+              <w:t xml:space="preserve">Lets the user update their name and email.</w:t>
             </w:r>
           </w:p>
         </w:tc>
@@ -1144,7 +1144,7 @@
                 <w:sz w:val="18"/>
                 <w:szCs w:val="18"/>
               </w:rPr>
-              <w:t xml:space="preserve">None (public)</w:t>
+              <w:t xml:space="preserve">Any (logged in)</w:t>
             </w:r>
           </w:p>
         </w:tc>
@@ -1174,7 +1174,7 @@
                 <w:sz w:val="18"/>
                 <w:szCs w:val="18"/>
               </w:rPr>
-              <w:t xml:space="preserve">None</w:t>
+              <w:t xml:space="preserve">{ "fullName": "string", "email": "string" }</w:t>
             </w:r>
           </w:p>
         </w:tc>
@@ -1204,7 +1204,7 @@
                 <w:sz w:val="18"/>
                 <w:szCs w:val="18"/>
               </w:rPr>
-              <w:t xml:space="preserve">200 OK - returns an array of events with their basic info (name, date, location).</w:t>
+              <w:t xml:space="preserve">200 OK - returns updated profile. 400 Bad Request - if the new email is already taken. 401 Unauthorized - if not logged in.</w:t>
             </w:r>
           </w:p>
         </w:tc>
@@ -1236,7 +1236,7 @@
                 <w:sz w:val="18"/>
                 <w:szCs w:val="18"/>
               </w:rPr>
-              <w:t xml:space="preserve">POST</w:t>
+              <w:t xml:space="preserve">GET</w:t>
             </w:r>
           </w:p>
         </w:tc>
@@ -1296,7 +1296,7 @@
                 <w:sz w:val="18"/>
                 <w:szCs w:val="18"/>
               </w:rPr>
-              <w:t xml:space="preserve">Creates a new event. Only organisers can do this, and the event gets linked to their account.</w:t>
+              <w:t xml:space="preserve">Returns a list of all active events. Anyone can see what events are coming up.</w:t>
             </w:r>
           </w:p>
         </w:tc>
@@ -1326,7 +1326,7 @@
                 <w:sz w:val="18"/>
                 <w:szCs w:val="18"/>
               </w:rPr>
-              <w:t xml:space="preserve">Organiser</w:t>
+              <w:t xml:space="preserve">None (public)</w:t>
             </w:r>
           </w:p>
         </w:tc>
@@ -1356,7 +1356,7 @@
                 <w:sz w:val="18"/>
                 <w:szCs w:val="18"/>
               </w:rPr>
-              <w:t xml:space="preserve">{ "eventName": "string", "description": "string", "eventDate": "datetime", "location": "string" }</w:t>
+              <w:t xml:space="preserve">None</w:t>
             </w:r>
           </w:p>
         </w:tc>
@@ -1386,7 +1386,7 @@
                 <w:sz w:val="18"/>
                 <w:szCs w:val="18"/>
               </w:rPr>
-              <w:t xml:space="preserve">201 Created - returns the new event with its ID. 400 Bad Request - if required fields are missing. 403 Forbidden - if a Participant tries to create an event.</w:t>
+              <w:t xml:space="preserve">200 OK - returns an array of events with their basic info (name, date, location).</w:t>
             </w:r>
           </w:p>
         </w:tc>
@@ -1418,7 +1418,7 @@
                 <w:sz w:val="18"/>
                 <w:szCs w:val="18"/>
               </w:rPr>
-              <w:t xml:space="preserve">GET</w:t>
+              <w:t xml:space="preserve">POST</w:t>
             </w:r>
           </w:p>
         </w:tc>
@@ -1448,7 +1448,7 @@
                 <w:sz w:val="18"/>
                 <w:szCs w:val="18"/>
               </w:rPr>
-              <w:t xml:space="preserve">/api/events/{id}</w:t>
+              <w:t xml:space="preserve">/api/events</w:t>
             </w:r>
           </w:p>
         </w:tc>
@@ -1478,7 +1478,7 @@
                 <w:sz w:val="18"/>
                 <w:szCs w:val="18"/>
               </w:rPr>
-              <w:t xml:space="preserve">Gets the full details of one event, including all its categories.</w:t>
+              <w:t xml:space="preserve">Creates a new event. Only organisers can do this, and the event gets linked to their account.</w:t>
             </w:r>
           </w:p>
         </w:tc>
@@ -1508,7 +1508,7 @@
                 <w:sz w:val="18"/>
                 <w:szCs w:val="18"/>
               </w:rPr>
-              <w:t xml:space="preserve">None (public)</w:t>
+              <w:t xml:space="preserve">Organiser</w:t>
             </w:r>
           </w:p>
         </w:tc>
@@ -1538,7 +1538,7 @@
                 <w:sz w:val="18"/>
                 <w:szCs w:val="18"/>
               </w:rPr>
-              <w:t xml:space="preserve">None</w:t>
+              <w:t xml:space="preserve">{ "eventName": "string", "description": "string", "eventDate": "datetime", "location": "string", "distance": "string", "eventType": "Run, Walk or Cycle" }</w:t>
             </w:r>
           </w:p>
         </w:tc>
@@ -1568,7 +1568,7 @@
                 <w:sz w:val="18"/>
                 <w:szCs w:val="18"/>
               </w:rPr>
-              <w:t xml:space="preserve">200 OK - returns event details with categories array. 404 Not Found - if the event does not exist.</w:t>
+              <w:t xml:space="preserve">201 Created - returns the new event with its ID. 400 Bad Request - if required fields are missing. 403 Forbidden - if a Participant tries to create an event.</w:t>
             </w:r>
           </w:p>
         </w:tc>
@@ -1600,7 +1600,7 @@
                 <w:sz w:val="18"/>
                 <w:szCs w:val="18"/>
               </w:rPr>
-              <w:t xml:space="preserve">PUT</w:t>
+              <w:t xml:space="preserve">GET</w:t>
             </w:r>
           </w:p>
         </w:tc>
@@ -1660,7 +1660,7 @@
                 <w:sz w:val="18"/>
                 <w:szCs w:val="18"/>
               </w:rPr>
-              <w:t xml:space="preserve">Updates an event's details. Only the organiser who created it can do this.</w:t>
+              <w:t xml:space="preserve">Gets the full details of one event, including all its categories.</w:t>
             </w:r>
           </w:p>
         </w:tc>
@@ -1690,7 +1690,7 @@
                 <w:sz w:val="18"/>
                 <w:szCs w:val="18"/>
               </w:rPr>
-              <w:t xml:space="preserve">Organiser</w:t>
+              <w:t xml:space="preserve">None (public)</w:t>
             </w:r>
           </w:p>
         </w:tc>
@@ -1720,7 +1720,7 @@
                 <w:sz w:val="18"/>
                 <w:szCs w:val="18"/>
               </w:rPr>
-              <w:t xml:space="preserve">{ "eventName": "string", "description": "string", "eventDate": "datetime", "location": "string" }</w:t>
+              <w:t xml:space="preserve">None</w:t>
             </w:r>
           </w:p>
         </w:tc>
@@ -1750,7 +1750,7 @@
                 <w:sz w:val="18"/>
                 <w:szCs w:val="18"/>
               </w:rPr>
-              <w:t xml:space="preserve">200 OK - returns the updated event. 403 Forbidden - if the user is not the organiser who created the event. 404 Not Found - if the event does not exist.</w:t>
+              <w:t xml:space="preserve">200 OK - returns event details with categories array. 404 Not Found - if the event does not exist.</w:t>
             </w:r>
           </w:p>
         </w:tc>
@@ -1782,7 +1782,7 @@
                 <w:sz w:val="18"/>
                 <w:szCs w:val="18"/>
               </w:rPr>
-              <w:t xml:space="preserve">DELETE</w:t>
+              <w:t xml:space="preserve">PUT</w:t>
             </w:r>
           </w:p>
         </w:tc>
@@ -1842,7 +1842,7 @@
                 <w:sz w:val="18"/>
                 <w:szCs w:val="18"/>
               </w:rPr>
-              <w:t xml:space="preserve">Deletes an event. This also removes all its categories and enrolments. Only the organiser who created it can do this.</w:t>
+              <w:t xml:space="preserve">Updates an event's details. Only the organiser who created it can do this.</w:t>
             </w:r>
           </w:p>
         </w:tc>
@@ -1902,7 +1902,7 @@
                 <w:sz w:val="18"/>
                 <w:szCs w:val="18"/>
               </w:rPr>
-              <w:t xml:space="preserve">None</w:t>
+              <w:t xml:space="preserve">{ "eventName": "string", "description": "string", "eventDate": "datetime", "location": "string", "distance": "string", "eventType": "Run, Walk or Cycle" }</w:t>
             </w:r>
           </w:p>
         </w:tc>
@@ -1932,7 +1932,7 @@
                 <w:sz w:val="18"/>
                 <w:szCs w:val="18"/>
               </w:rPr>
-              <w:t xml:space="preserve">204 No Content - if deleted successfully. 403 Forbidden - if the user is not the owner. 404 Not Found - if the event does not exist.</w:t>
+              <w:t xml:space="preserve">200 OK - returns the updated event. 403 Forbidden - if the user is not the organiser who created the event. 404 Not Found - if the event does not exist.</w:t>
             </w:r>
           </w:p>
         </w:tc>
@@ -1964,7 +1964,7 @@
                 <w:sz w:val="18"/>
                 <w:szCs w:val="18"/>
               </w:rPr>
-              <w:t xml:space="preserve">GET</w:t>
+              <w:t xml:space="preserve">DELETE</w:t>
             </w:r>
           </w:p>
         </w:tc>
@@ -1994,7 +1994,7 @@
                 <w:sz w:val="18"/>
                 <w:szCs w:val="18"/>
               </w:rPr>
-              <w:t xml:space="preserve">/api/events/{eventId}/categories</w:t>
+              <w:t xml:space="preserve">/api/events/{id}</w:t>
             </w:r>
           </w:p>
         </w:tc>
@@ -2024,7 +2024,7 @@
                 <w:sz w:val="18"/>
                 <w:szCs w:val="18"/>
               </w:rPr>
-              <w:t xml:space="preserve">Lists all categories for a specific event.</w:t>
+              <w:t xml:space="preserve">Deletes an event. This also removes all its categories and enrolments. Only the organiser who created it can do this.</w:t>
             </w:r>
           </w:p>
         </w:tc>
@@ -2054,7 +2054,7 @@
                 <w:sz w:val="18"/>
                 <w:szCs w:val="18"/>
               </w:rPr>
-              <w:t xml:space="preserve">None (public)</w:t>
+              <w:t xml:space="preserve">Organiser</w:t>
             </w:r>
           </w:p>
         </w:tc>
@@ -2114,7 +2114,7 @@
                 <w:sz w:val="18"/>
                 <w:szCs w:val="18"/>
               </w:rPr>
-              <w:t xml:space="preserve">200 OK - returns an array of categories with name, max participants, and entry fee. 404 Not Found - if the event does not exist.</w:t>
+              <w:t xml:space="preserve">204 No Content - if deleted successfully. 403 Forbidden - if the user is not the owner. 404 Not Found - if the event does not exist.</w:t>
             </w:r>
           </w:p>
         </w:tc>
@@ -2146,7 +2146,7 @@
                 <w:sz w:val="18"/>
                 <w:szCs w:val="18"/>
               </w:rPr>
-              <w:t xml:space="preserve">POST</w:t>
+              <w:t xml:space="preserve">GET</w:t>
             </w:r>
           </w:p>
         </w:tc>
@@ -2206,7 +2206,7 @@
                 <w:sz w:val="18"/>
                 <w:szCs w:val="18"/>
               </w:rPr>
-              <w:t xml:space="preserve">Adds a new category to an event. Only the event's organiser can do this.</w:t>
+              <w:t xml:space="preserve">Lists all categories for a specific event.</w:t>
             </w:r>
           </w:p>
         </w:tc>
@@ -2236,7 +2236,7 @@
                 <w:sz w:val="18"/>
                 <w:szCs w:val="18"/>
               </w:rPr>
-              <w:t xml:space="preserve">Organiser</w:t>
+              <w:t xml:space="preserve">None (public)</w:t>
             </w:r>
           </w:p>
         </w:tc>
@@ -2266,7 +2266,7 @@
                 <w:sz w:val="18"/>
                 <w:szCs w:val="18"/>
               </w:rPr>
-              <w:t xml:space="preserve">{ "categoryName": "string", "maxParticipants": 0, "entryFee": 0.00 }</w:t>
+              <w:t xml:space="preserve">None</w:t>
             </w:r>
           </w:p>
         </w:tc>
@@ -2296,7 +2296,7 @@
                 <w:sz w:val="18"/>
                 <w:szCs w:val="18"/>
               </w:rPr>
-              <w:t xml:space="preserve">201 Created - returns the new category. 400 Bad Request - if fields are missing. 403 Forbidden - if the user is not the event's organiser. 404 Not Found - if the event does not exist.</w:t>
+              <w:t xml:space="preserve">200 OK - returns an array of categories with name, max participants, and entry fee. 404 Not Found - if the event does not exist.</w:t>
             </w:r>
           </w:p>
         </w:tc>
@@ -2328,7 +2328,7 @@
                 <w:sz w:val="18"/>
                 <w:szCs w:val="18"/>
               </w:rPr>
-              <w:t xml:space="preserve">PUT</w:t>
+              <w:t xml:space="preserve">POST</w:t>
             </w:r>
           </w:p>
         </w:tc>
@@ -2358,7 +2358,7 @@
                 <w:sz w:val="18"/>
                 <w:szCs w:val="18"/>
               </w:rPr>
-              <w:t xml:space="preserve">/api/categories/{id}</w:t>
+              <w:t xml:space="preserve">/api/events/{eventId}/categories</w:t>
             </w:r>
           </w:p>
         </w:tc>
@@ -2388,7 +2388,7 @@
                 <w:sz w:val="18"/>
                 <w:szCs w:val="18"/>
               </w:rPr>
-              <w:t xml:space="preserve">Updates a category's details. Only the organiser who owns the parent event can do this.</w:t>
+              <w:t xml:space="preserve">Adds a new category to an event. Only the event's organiser can do this.</w:t>
             </w:r>
           </w:p>
         </w:tc>
@@ -2478,7 +2478,7 @@
                 <w:sz w:val="18"/>
                 <w:szCs w:val="18"/>
               </w:rPr>
-              <w:t xml:space="preserve">200 OK - returns the updated category. 403 Forbidden - if not the owner. 404 Not Found - if the category does not exist.</w:t>
+              <w:t xml:space="preserve">201 Created - returns the new category. 400 Bad Request - if fields are missing. 403 Forbidden - if the user is not the event's organiser. 404 Not Found - if the event does not exist.</w:t>
             </w:r>
           </w:p>
         </w:tc>
@@ -2510,7 +2510,7 @@
                 <w:sz w:val="18"/>
                 <w:szCs w:val="18"/>
               </w:rPr>
-              <w:t xml:space="preserve">DELETE</w:t>
+              <w:t xml:space="preserve">PUT</w:t>
             </w:r>
           </w:p>
         </w:tc>
@@ -2570,7 +2570,7 @@
                 <w:sz w:val="18"/>
                 <w:szCs w:val="18"/>
               </w:rPr>
-              <w:t xml:space="preserve">Removes a category from an event. This will also remove any enrolments in that category.</w:t>
+              <w:t xml:space="preserve">Updates a category's details. Only the organiser who owns the parent event can do this.</w:t>
             </w:r>
           </w:p>
         </w:tc>
@@ -2630,7 +2630,7 @@
                 <w:sz w:val="18"/>
                 <w:szCs w:val="18"/>
               </w:rPr>
-              <w:t xml:space="preserve">None</w:t>
+              <w:t xml:space="preserve">{ "categoryName": "string", "maxParticipants": 0, "entryFee": 0.00 }</w:t>
             </w:r>
           </w:p>
         </w:tc>
@@ -2660,7 +2660,7 @@
                 <w:sz w:val="18"/>
                 <w:szCs w:val="18"/>
               </w:rPr>
-              <w:t xml:space="preserve">204 No Content - if deleted. 403 Forbidden - if not the owner. 404 Not Found - if not found.</w:t>
+              <w:t xml:space="preserve">200 OK - returns the updated category. 403 Forbidden - if not the owner. 404 Not Found - if the category does not exist.</w:t>
             </w:r>
           </w:p>
         </w:tc>
@@ -2692,7 +2692,7 @@
                 <w:sz w:val="18"/>
                 <w:szCs w:val="18"/>
               </w:rPr>
-              <w:t xml:space="preserve">POST</w:t>
+              <w:t xml:space="preserve">DELETE</w:t>
             </w:r>
           </w:p>
         </w:tc>
@@ -2722,7 +2722,7 @@
                 <w:sz w:val="18"/>
                 <w:szCs w:val="18"/>
               </w:rPr>
-              <w:t xml:space="preserve">/api/categories/{categoryId}/enrol</w:t>
+              <w:t xml:space="preserve">/api/categories/{id}</w:t>
             </w:r>
           </w:p>
         </w:tc>
@@ -2752,7 +2752,7 @@
                 <w:sz w:val="18"/>
                 <w:szCs w:val="18"/>
               </w:rPr>
-              <w:t xml:space="preserve">Lets a participant sign up for a category. The system checks if the category is full before allowing it.</w:t>
+              <w:t xml:space="preserve">Removes a category from an event. This will also remove any enrolments in that category.</w:t>
             </w:r>
           </w:p>
         </w:tc>
@@ -2782,7 +2782,7 @@
                 <w:sz w:val="18"/>
                 <w:szCs w:val="18"/>
               </w:rPr>
-              <w:t xml:space="preserve">Participant</w:t>
+              <w:t xml:space="preserve">Organiser</w:t>
             </w:r>
           </w:p>
         </w:tc>
@@ -2842,7 +2842,7 @@
                 <w:sz w:val="18"/>
                 <w:szCs w:val="18"/>
               </w:rPr>
-              <w:t xml:space="preserve">201 Created - returns the enrolment with a confirmation message. 409 Conflict - if the participant is already enrolled or the category is full. 403 Forbidden - if an Organiser tries to enrol. 404 Not Found - if the category does not exist.</w:t>
+              <w:t xml:space="preserve">204 No Content - if deleted. 403 Forbidden - if not the owner. 404 Not Found - if not found.</w:t>
             </w:r>
           </w:p>
         </w:tc>
@@ -2874,7 +2874,7 @@
                 <w:sz w:val="18"/>
                 <w:szCs w:val="18"/>
               </w:rPr>
-              <w:t xml:space="preserve">GET</w:t>
+              <w:t xml:space="preserve">POST</w:t>
             </w:r>
           </w:p>
         </w:tc>
@@ -2904,7 +2904,7 @@
                 <w:sz w:val="18"/>
                 <w:szCs w:val="18"/>
               </w:rPr>
-              <w:t xml:space="preserve">/api/users/enrolments</w:t>
+              <w:t xml:space="preserve">/api/categories/{categoryId}/enrol</w:t>
             </w:r>
           </w:p>
         </w:tc>
@@ -2934,7 +2934,7 @@
                 <w:sz w:val="18"/>
                 <w:szCs w:val="18"/>
               </w:rPr>
-              <w:t xml:space="preserve">Shows all the events a participant has signed up for.</w:t>
+              <w:t xml:space="preserve">Lets a participant sign up for a category. The system checks if the category is full before allowing it.</w:t>
             </w:r>
           </w:p>
         </w:tc>
@@ -3024,7 +3024,7 @@
                 <w:sz w:val="18"/>
                 <w:szCs w:val="18"/>
               </w:rPr>
-              <w:t xml:space="preserve">200 OK - returns an array of enrolments with event and category details. 401 Unauthorized - if not logged in.</w:t>
+              <w:t xml:space="preserve">201 Created - returns the enrolment with a confirmation message. 409 Conflict - if the participant is already enrolled or the category is full. 403 Forbidden - if an Organiser tries to enrol. 404 Not Found - if the category does not exist.</w:t>
             </w:r>
           </w:p>
         </w:tc>
@@ -3056,7 +3056,7 @@
                 <w:sz w:val="18"/>
                 <w:szCs w:val="18"/>
               </w:rPr>
-              <w:t xml:space="preserve">DELETE</w:t>
+              <w:t xml:space="preserve">GET</w:t>
             </w:r>
           </w:p>
         </w:tc>
@@ -3086,7 +3086,7 @@
                 <w:sz w:val="18"/>
                 <w:szCs w:val="18"/>
               </w:rPr>
-              <w:t xml:space="preserve">/api/enrolments/{id}</w:t>
+              <w:t xml:space="preserve">/api/users/enrolments</w:t>
             </w:r>
           </w:p>
         </w:tc>
@@ -3116,7 +3116,7 @@
                 <w:sz w:val="18"/>
                 <w:szCs w:val="18"/>
               </w:rPr>
-              <w:t xml:space="preserve">Cancels an enrolment. The participant can only cancel their own enrolments.</w:t>
+              <w:t xml:space="preserve">Shows all the events a participant has signed up for.</w:t>
             </w:r>
           </w:p>
         </w:tc>
@@ -3206,7 +3206,7 @@
                 <w:sz w:val="18"/>
                 <w:szCs w:val="18"/>
               </w:rPr>
-              <w:t xml:space="preserve">204 No Content - if cancelled. 403 Forbidden - if trying to cancel someone else's enrolment. 404 Not Found - if the enrolment does not exist.</w:t>
+              <w:t xml:space="preserve">200 OK - returns an array of enrolments with event and category details. 401 Unauthorized - if not logged in.</w:t>
             </w:r>
           </w:p>
         </w:tc>
@@ -3238,7 +3238,7 @@
                 <w:sz w:val="18"/>
                 <w:szCs w:val="18"/>
               </w:rPr>
-              <w:t xml:space="preserve">GET</w:t>
+              <w:t xml:space="preserve">DELETE</w:t>
             </w:r>
           </w:p>
         </w:tc>
@@ -3268,7 +3268,7 @@
                 <w:sz w:val="18"/>
                 <w:szCs w:val="18"/>
               </w:rPr>
-              <w:t xml:space="preserve">/api/events/{eventId}/results</w:t>
+              <w:t xml:space="preserve">/api/enrolments/{id}</w:t>
             </w:r>
           </w:p>
         </w:tc>
@@ -3298,7 +3298,7 @@
                 <w:sz w:val="18"/>
                 <w:szCs w:val="18"/>
               </w:rPr>
-              <w:t xml:space="preserve">Shows the results for an event, sorted by position.</w:t>
+              <w:t xml:space="preserve">Cancels an enrolment. The participant can only cancel their own enrolments.</w:t>
             </w:r>
           </w:p>
         </w:tc>
@@ -3328,7 +3328,7 @@
                 <w:sz w:val="18"/>
                 <w:szCs w:val="18"/>
               </w:rPr>
-              <w:t xml:space="preserve">None (public)</w:t>
+              <w:t xml:space="preserve">Participant</w:t>
             </w:r>
           </w:p>
         </w:tc>
@@ -3388,7 +3388,7 @@
                 <w:sz w:val="18"/>
                 <w:szCs w:val="18"/>
               </w:rPr>
-              <w:t xml:space="preserve">200 OK - returns results with participant name, finish time, and position. 404 Not Found - if the event does not exist.</w:t>
+              <w:t xml:space="preserve">204 No Content - if cancelled. 403 Forbidden - if trying to cancel someone else's enrolment. 404 Not Found - if the enrolment does not exist.</w:t>
             </w:r>
           </w:p>
         </w:tc>
@@ -3420,7 +3420,7 @@
                 <w:sz w:val="18"/>
                 <w:szCs w:val="18"/>
               </w:rPr>
-              <w:t xml:space="preserve">POST</w:t>
+              <w:t xml:space="preserve">GET</w:t>
             </w:r>
           </w:p>
         </w:tc>
@@ -3450,7 +3450,7 @@
                 <w:sz w:val="18"/>
                 <w:szCs w:val="18"/>
               </w:rPr>
-              <w:t xml:space="preserve">/api/events/{eventId}/results</w:t>
+              <w:t xml:space="preserve">/api/events/{eventId}/enrolments</w:t>
             </w:r>
           </w:p>
         </w:tc>
@@ -3480,7 +3480,7 @@
                 <w:sz w:val="18"/>
                 <w:szCs w:val="18"/>
               </w:rPr>
-              <w:t xml:space="preserve">Adds a result for a participant. Only the event's organiser can do this.</w:t>
+              <w:t xml:space="preserve">Lists every enrolment for one of the organiser's own events, with the participant and category details. This is how an organiser sees who entered their event.</w:t>
             </w:r>
           </w:p>
         </w:tc>
@@ -3540,7 +3540,7 @@
                 <w:sz w:val="18"/>
                 <w:szCs w:val="18"/>
               </w:rPr>
-              <w:t xml:space="preserve">{ "enrolmentId": 0, "finishTime": "HH:MM:SS", "position": 0, "status": "Finished" }</w:t>
+              <w:t xml:space="preserve">None</w:t>
             </w:r>
           </w:p>
         </w:tc>
@@ -3570,7 +3570,7 @@
                 <w:sz w:val="18"/>
                 <w:szCs w:val="18"/>
               </w:rPr>
-              <w:t xml:space="preserve">201 Created - returns the result. 400 Bad Request - if the enrolment ID is invalid. 403 Forbidden - if not the event's organiser. 409 Conflict - if a result already exists for this enrolment. 404 Not Found - if the event does not exist.</w:t>
+              <w:t xml:space="preserve">200 OK - returns an array of enrolments for that event. 403 Forbidden - if the organiser did not create the event. 404 Not Found - if the event does not exist.</w:t>
             </w:r>
           </w:p>
         </w:tc>
@@ -3602,6 +3602,370 @@
                 <w:sz w:val="18"/>
                 <w:szCs w:val="18"/>
               </w:rPr>
+              <w:t xml:space="preserve">GET</w:t>
+            </w:r>
+          </w:p>
+        </w:tc>
+        <w:tc>
+          <w:tcPr>
+            <w:tcW w:type="dxa" w:w="1800"/>
+            <w:tcBorders>
+              <w:top w:val="single" w:color="999999" w:sz="1"/>
+              <w:left w:val="single" w:color="999999" w:sz="1"/>
+              <w:bottom w:val="single" w:color="999999" w:sz="1"/>
+              <w:right w:val="single" w:color="999999" w:sz="1"/>
+            </w:tcBorders>
+            <w:tcMar>
+              <w:top w:type="dxa" w:w="60"/>
+              <w:left w:type="dxa" w:w="100"/>
+              <w:bottom w:type="dxa" w:w="60"/>
+              <w:right w:type="dxa" w:w="100"/>
+            </w:tcMar>
+          </w:tcPr>
+          <w:p>
+            <w:r>
+              <w:rPr>
+                <w:rFonts w:ascii="Arial" w:cs="Arial" w:eastAsia="Arial" w:hAnsi="Arial"/>
+                <w:b w:val="false"/>
+                <w:bCs w:val="false"/>
+                <w:color w:val="000000"/>
+                <w:sz w:val="18"/>
+                <w:szCs w:val="18"/>
+              </w:rPr>
+              <w:t xml:space="preserve">/api/events/{eventId}/results</w:t>
+            </w:r>
+          </w:p>
+        </w:tc>
+        <w:tc>
+          <w:tcPr>
+            <w:tcW w:type="dxa" w:w="2200"/>
+            <w:tcBorders>
+              <w:top w:val="single" w:color="999999" w:sz="1"/>
+              <w:left w:val="single" w:color="999999" w:sz="1"/>
+              <w:bottom w:val="single" w:color="999999" w:sz="1"/>
+              <w:right w:val="single" w:color="999999" w:sz="1"/>
+            </w:tcBorders>
+            <w:tcMar>
+              <w:top w:type="dxa" w:w="60"/>
+              <w:left w:type="dxa" w:w="100"/>
+              <w:bottom w:type="dxa" w:w="60"/>
+              <w:right w:type="dxa" w:w="100"/>
+            </w:tcMar>
+          </w:tcPr>
+          <w:p>
+            <w:r>
+              <w:rPr>
+                <w:rFonts w:ascii="Arial" w:cs="Arial" w:eastAsia="Arial" w:hAnsi="Arial"/>
+                <w:b w:val="false"/>
+                <w:bCs w:val="false"/>
+                <w:color w:val="000000"/>
+                <w:sz w:val="18"/>
+                <w:szCs w:val="18"/>
+              </w:rPr>
+              <w:t xml:space="preserve">Shows the results for an event, sorted by position.</w:t>
+            </w:r>
+          </w:p>
+        </w:tc>
+        <w:tc>
+          <w:tcPr>
+            <w:tcW w:type="dxa" w:w="1100"/>
+            <w:tcBorders>
+              <w:top w:val="single" w:color="999999" w:sz="1"/>
+              <w:left w:val="single" w:color="999999" w:sz="1"/>
+              <w:bottom w:val="single" w:color="999999" w:sz="1"/>
+              <w:right w:val="single" w:color="999999" w:sz="1"/>
+            </w:tcBorders>
+            <w:tcMar>
+              <w:top w:type="dxa" w:w="60"/>
+              <w:left w:type="dxa" w:w="100"/>
+              <w:bottom w:type="dxa" w:w="60"/>
+              <w:right w:type="dxa" w:w="100"/>
+            </w:tcMar>
+          </w:tcPr>
+          <w:p>
+            <w:r>
+              <w:rPr>
+                <w:rFonts w:ascii="Arial" w:cs="Arial" w:eastAsia="Arial" w:hAnsi="Arial"/>
+                <w:b w:val="false"/>
+                <w:bCs w:val="false"/>
+                <w:color w:val="000000"/>
+                <w:sz w:val="18"/>
+                <w:szCs w:val="18"/>
+              </w:rPr>
+              <w:t xml:space="preserve">None (public)</w:t>
+            </w:r>
+          </w:p>
+        </w:tc>
+        <w:tc>
+          <w:tcPr>
+            <w:tcW w:type="dxa" w:w="1660"/>
+            <w:tcBorders>
+              <w:top w:val="single" w:color="999999" w:sz="1"/>
+              <w:left w:val="single" w:color="999999" w:sz="1"/>
+              <w:bottom w:val="single" w:color="999999" w:sz="1"/>
+              <w:right w:val="single" w:color="999999" w:sz="1"/>
+            </w:tcBorders>
+            <w:tcMar>
+              <w:top w:type="dxa" w:w="60"/>
+              <w:left w:type="dxa" w:w="100"/>
+              <w:bottom w:type="dxa" w:w="60"/>
+              <w:right w:type="dxa" w:w="100"/>
+            </w:tcMar>
+          </w:tcPr>
+          <w:p>
+            <w:r>
+              <w:rPr>
+                <w:rFonts w:ascii="Arial" w:cs="Arial" w:eastAsia="Arial" w:hAnsi="Arial"/>
+                <w:b w:val="false"/>
+                <w:bCs w:val="false"/>
+                <w:color w:val="000000"/>
+                <w:sz w:val="18"/>
+                <w:szCs w:val="18"/>
+              </w:rPr>
+              <w:t xml:space="preserve">None</w:t>
+            </w:r>
+          </w:p>
+        </w:tc>
+        <w:tc>
+          <w:tcPr>
+            <w:tcW w:type="dxa" w:w="1700"/>
+            <w:tcBorders>
+              <w:top w:val="single" w:color="999999" w:sz="1"/>
+              <w:left w:val="single" w:color="999999" w:sz="1"/>
+              <w:bottom w:val="single" w:color="999999" w:sz="1"/>
+              <w:right w:val="single" w:color="999999" w:sz="1"/>
+            </w:tcBorders>
+            <w:tcMar>
+              <w:top w:type="dxa" w:w="60"/>
+              <w:left w:type="dxa" w:w="100"/>
+              <w:bottom w:type="dxa" w:w="60"/>
+              <w:right w:type="dxa" w:w="100"/>
+            </w:tcMar>
+          </w:tcPr>
+          <w:p>
+            <w:r>
+              <w:rPr>
+                <w:rFonts w:ascii="Arial" w:cs="Arial" w:eastAsia="Arial" w:hAnsi="Arial"/>
+                <w:b w:val="false"/>
+                <w:bCs w:val="false"/>
+                <w:color w:val="000000"/>
+                <w:sz w:val="18"/>
+                <w:szCs w:val="18"/>
+              </w:rPr>
+              <w:t xml:space="preserve">200 OK - returns results with participant name, finish time, and position. 404 Not Found - if the event does not exist.</w:t>
+            </w:r>
+          </w:p>
+        </w:tc>
+      </w:tr>
+      <w:tr>
+        <w:tc>
+          <w:tcPr>
+            <w:tcW w:type="dxa" w:w="900"/>
+            <w:tcBorders>
+              <w:top w:val="single" w:color="999999" w:sz="1"/>
+              <w:left w:val="single" w:color="999999" w:sz="1"/>
+              <w:bottom w:val="single" w:color="999999" w:sz="1"/>
+              <w:right w:val="single" w:color="999999" w:sz="1"/>
+            </w:tcBorders>
+            <w:tcMar>
+              <w:top w:type="dxa" w:w="60"/>
+              <w:left w:type="dxa" w:w="100"/>
+              <w:bottom w:type="dxa" w:w="60"/>
+              <w:right w:type="dxa" w:w="100"/>
+            </w:tcMar>
+          </w:tcPr>
+          <w:p>
+            <w:r>
+              <w:rPr>
+                <w:rFonts w:ascii="Arial" w:cs="Arial" w:eastAsia="Arial" w:hAnsi="Arial"/>
+                <w:b w:val="false"/>
+                <w:bCs w:val="false"/>
+                <w:color w:val="000000"/>
+                <w:sz w:val="18"/>
+                <w:szCs w:val="18"/>
+              </w:rPr>
+              <w:t xml:space="preserve">POST</w:t>
+            </w:r>
+          </w:p>
+        </w:tc>
+        <w:tc>
+          <w:tcPr>
+            <w:tcW w:type="dxa" w:w="1800"/>
+            <w:tcBorders>
+              <w:top w:val="single" w:color="999999" w:sz="1"/>
+              <w:left w:val="single" w:color="999999" w:sz="1"/>
+              <w:bottom w:val="single" w:color="999999" w:sz="1"/>
+              <w:right w:val="single" w:color="999999" w:sz="1"/>
+            </w:tcBorders>
+            <w:tcMar>
+              <w:top w:type="dxa" w:w="60"/>
+              <w:left w:type="dxa" w:w="100"/>
+              <w:bottom w:type="dxa" w:w="60"/>
+              <w:right w:type="dxa" w:w="100"/>
+            </w:tcMar>
+          </w:tcPr>
+          <w:p>
+            <w:r>
+              <w:rPr>
+                <w:rFonts w:ascii="Arial" w:cs="Arial" w:eastAsia="Arial" w:hAnsi="Arial"/>
+                <w:b w:val="false"/>
+                <w:bCs w:val="false"/>
+                <w:color w:val="000000"/>
+                <w:sz w:val="18"/>
+                <w:szCs w:val="18"/>
+              </w:rPr>
+              <w:t xml:space="preserve">/api/events/{eventId}/results</w:t>
+            </w:r>
+          </w:p>
+        </w:tc>
+        <w:tc>
+          <w:tcPr>
+            <w:tcW w:type="dxa" w:w="2200"/>
+            <w:tcBorders>
+              <w:top w:val="single" w:color="999999" w:sz="1"/>
+              <w:left w:val="single" w:color="999999" w:sz="1"/>
+              <w:bottom w:val="single" w:color="999999" w:sz="1"/>
+              <w:right w:val="single" w:color="999999" w:sz="1"/>
+            </w:tcBorders>
+            <w:tcMar>
+              <w:top w:type="dxa" w:w="60"/>
+              <w:left w:type="dxa" w:w="100"/>
+              <w:bottom w:type="dxa" w:w="60"/>
+              <w:right w:type="dxa" w:w="100"/>
+            </w:tcMar>
+          </w:tcPr>
+          <w:p>
+            <w:r>
+              <w:rPr>
+                <w:rFonts w:ascii="Arial" w:cs="Arial" w:eastAsia="Arial" w:hAnsi="Arial"/>
+                <w:b w:val="false"/>
+                <w:bCs w:val="false"/>
+                <w:color w:val="000000"/>
+                <w:sz w:val="18"/>
+                <w:szCs w:val="18"/>
+              </w:rPr>
+              <w:t xml:space="preserve">Adds a result for a participant. Only the event's organiser can do this.</w:t>
+            </w:r>
+          </w:p>
+        </w:tc>
+        <w:tc>
+          <w:tcPr>
+            <w:tcW w:type="dxa" w:w="1100"/>
+            <w:tcBorders>
+              <w:top w:val="single" w:color="999999" w:sz="1"/>
+              <w:left w:val="single" w:color="999999" w:sz="1"/>
+              <w:bottom w:val="single" w:color="999999" w:sz="1"/>
+              <w:right w:val="single" w:color="999999" w:sz="1"/>
+            </w:tcBorders>
+            <w:tcMar>
+              <w:top w:type="dxa" w:w="60"/>
+              <w:left w:type="dxa" w:w="100"/>
+              <w:bottom w:type="dxa" w:w="60"/>
+              <w:right w:type="dxa" w:w="100"/>
+            </w:tcMar>
+          </w:tcPr>
+          <w:p>
+            <w:r>
+              <w:rPr>
+                <w:rFonts w:ascii="Arial" w:cs="Arial" w:eastAsia="Arial" w:hAnsi="Arial"/>
+                <w:b w:val="false"/>
+                <w:bCs w:val="false"/>
+                <w:color w:val="000000"/>
+                <w:sz w:val="18"/>
+                <w:szCs w:val="18"/>
+              </w:rPr>
+              <w:t xml:space="preserve">Organiser</w:t>
+            </w:r>
+          </w:p>
+        </w:tc>
+        <w:tc>
+          <w:tcPr>
+            <w:tcW w:type="dxa" w:w="1660"/>
+            <w:tcBorders>
+              <w:top w:val="single" w:color="999999" w:sz="1"/>
+              <w:left w:val="single" w:color="999999" w:sz="1"/>
+              <w:bottom w:val="single" w:color="999999" w:sz="1"/>
+              <w:right w:val="single" w:color="999999" w:sz="1"/>
+            </w:tcBorders>
+            <w:tcMar>
+              <w:top w:type="dxa" w:w="60"/>
+              <w:left w:type="dxa" w:w="100"/>
+              <w:bottom w:type="dxa" w:w="60"/>
+              <w:right w:type="dxa" w:w="100"/>
+            </w:tcMar>
+          </w:tcPr>
+          <w:p>
+            <w:r>
+              <w:rPr>
+                <w:rFonts w:ascii="Arial" w:cs="Arial" w:eastAsia="Arial" w:hAnsi="Arial"/>
+                <w:b w:val="false"/>
+                <w:bCs w:val="false"/>
+                <w:color w:val="000000"/>
+                <w:sz w:val="18"/>
+                <w:szCs w:val="18"/>
+              </w:rPr>
+              <w:t xml:space="preserve">{ "enrolmentId": 0, "finishTime": "HH:MM:SS", "position": 0, "status": "Finished" }</w:t>
+            </w:r>
+          </w:p>
+        </w:tc>
+        <w:tc>
+          <w:tcPr>
+            <w:tcW w:type="dxa" w:w="1700"/>
+            <w:tcBorders>
+              <w:top w:val="single" w:color="999999" w:sz="1"/>
+              <w:left w:val="single" w:color="999999" w:sz="1"/>
+              <w:bottom w:val="single" w:color="999999" w:sz="1"/>
+              <w:right w:val="single" w:color="999999" w:sz="1"/>
+            </w:tcBorders>
+            <w:tcMar>
+              <w:top w:type="dxa" w:w="60"/>
+              <w:left w:type="dxa" w:w="100"/>
+              <w:bottom w:type="dxa" w:w="60"/>
+              <w:right w:type="dxa" w:w="100"/>
+            </w:tcMar>
+          </w:tcPr>
+          <w:p>
+            <w:r>
+              <w:rPr>
+                <w:rFonts w:ascii="Arial" w:cs="Arial" w:eastAsia="Arial" w:hAnsi="Arial"/>
+                <w:b w:val="false"/>
+                <w:bCs w:val="false"/>
+                <w:color w:val="000000"/>
+                <w:sz w:val="18"/>
+                <w:szCs w:val="18"/>
+              </w:rPr>
+              <w:t xml:space="preserve">201 Created - returns the result. 400 Bad Request - if the enrolment ID is invalid. 403 Forbidden - if not the event's organiser. 409 Conflict - if a result already exists for this enrolment. 404 Not Found - if the event does not exist.</w:t>
+            </w:r>
+          </w:p>
+        </w:tc>
+      </w:tr>
+      <w:tr>
+        <w:tc>
+          <w:tcPr>
+            <w:tcW w:type="dxa" w:w="900"/>
+            <w:tcBorders>
+              <w:top w:val="single" w:color="999999" w:sz="1"/>
+              <w:left w:val="single" w:color="999999" w:sz="1"/>
+              <w:bottom w:val="single" w:color="999999" w:sz="1"/>
+              <w:right w:val="single" w:color="999999" w:sz="1"/>
+            </w:tcBorders>
+            <w:tcMar>
+              <w:top w:type="dxa" w:w="60"/>
+              <w:left w:type="dxa" w:w="100"/>
+              <w:bottom w:type="dxa" w:w="60"/>
+              <w:right w:type="dxa" w:w="100"/>
+            </w:tcMar>
+          </w:tcPr>
+          <w:p>
+            <w:r>
+              <w:rPr>
+                <w:rFonts w:ascii="Arial" w:cs="Arial" w:eastAsia="Arial" w:hAnsi="Arial"/>
+                <w:b w:val="false"/>
+                <w:bCs w:val="false"/>
+                <w:color w:val="000000"/>
+                <w:sz w:val="18"/>
+                <w:szCs w:val="18"/>
+              </w:rPr>
               <w:t xml:space="preserve">PUT</w:t>
             </w:r>
           </w:p>
@@ -3753,6 +4117,188 @@
                 <w:szCs w:val="18"/>
               </w:rPr>
               <w:t xml:space="preserve">200 OK - returns the updated result. 403 Forbidden - if not the organiser. 404 Not Found - if the result does not exist.</w:t>
+            </w:r>
+          </w:p>
+        </w:tc>
+      </w:tr>
+      <w:tr>
+        <w:tc>
+          <w:tcPr>
+            <w:tcW w:type="dxa" w:w="900"/>
+            <w:tcBorders>
+              <w:top w:val="single" w:color="999999" w:sz="1"/>
+              <w:left w:val="single" w:color="999999" w:sz="1"/>
+              <w:bottom w:val="single" w:color="999999" w:sz="1"/>
+              <w:right w:val="single" w:color="999999" w:sz="1"/>
+            </w:tcBorders>
+            <w:tcMar>
+              <w:top w:type="dxa" w:w="60"/>
+              <w:left w:type="dxa" w:w="100"/>
+              <w:bottom w:type="dxa" w:w="60"/>
+              <w:right w:type="dxa" w:w="100"/>
+            </w:tcMar>
+          </w:tcPr>
+          <w:p>
+            <w:r>
+              <w:rPr>
+                <w:rFonts w:ascii="Arial" w:cs="Arial" w:eastAsia="Arial" w:hAnsi="Arial"/>
+                <w:b w:val="false"/>
+                <w:bCs w:val="false"/>
+                <w:color w:val="000000"/>
+                <w:sz w:val="18"/>
+                <w:szCs w:val="18"/>
+              </w:rPr>
+              <w:t xml:space="preserve">GET</w:t>
+            </w:r>
+          </w:p>
+        </w:tc>
+        <w:tc>
+          <w:tcPr>
+            <w:tcW w:type="dxa" w:w="1800"/>
+            <w:tcBorders>
+              <w:top w:val="single" w:color="999999" w:sz="1"/>
+              <w:left w:val="single" w:color="999999" w:sz="1"/>
+              <w:bottom w:val="single" w:color="999999" w:sz="1"/>
+              <w:right w:val="single" w:color="999999" w:sz="1"/>
+            </w:tcBorders>
+            <w:tcMar>
+              <w:top w:type="dxa" w:w="60"/>
+              <w:left w:type="dxa" w:w="100"/>
+              <w:bottom w:type="dxa" w:w="60"/>
+              <w:right w:type="dxa" w:w="100"/>
+            </w:tcMar>
+          </w:tcPr>
+          <w:p>
+            <w:r>
+              <w:rPr>
+                <w:rFonts w:ascii="Arial" w:cs="Arial" w:eastAsia="Arial" w:hAnsi="Arial"/>
+                <w:b w:val="false"/>
+                <w:bCs w:val="false"/>
+                <w:color w:val="000000"/>
+                <w:sz w:val="18"/>
+                <w:szCs w:val="18"/>
+              </w:rPr>
+              <w:t xml:space="preserve">/api/users/results</w:t>
+            </w:r>
+          </w:p>
+        </w:tc>
+        <w:tc>
+          <w:tcPr>
+            <w:tcW w:type="dxa" w:w="2200"/>
+            <w:tcBorders>
+              <w:top w:val="single" w:color="999999" w:sz="1"/>
+              <w:left w:val="single" w:color="999999" w:sz="1"/>
+              <w:bottom w:val="single" w:color="999999" w:sz="1"/>
+              <w:right w:val="single" w:color="999999" w:sz="1"/>
+            </w:tcBorders>
+            <w:tcMar>
+              <w:top w:type="dxa" w:w="60"/>
+              <w:left w:type="dxa" w:w="100"/>
+              <w:bottom w:type="dxa" w:w="60"/>
+              <w:right w:type="dxa" w:w="100"/>
+            </w:tcMar>
+          </w:tcPr>
+          <w:p>
+            <w:r>
+              <w:rPr>
+                <w:rFonts w:ascii="Arial" w:cs="Arial" w:eastAsia="Arial" w:hAnsi="Arial"/>
+                <w:b w:val="false"/>
+                <w:bCs w:val="false"/>
+                <w:color w:val="000000"/>
+                <w:sz w:val="18"/>
+                <w:szCs w:val="18"/>
+              </w:rPr>
+              <w:t xml:space="preserve">Shows the logged-in user's own race results across every event they entered, so a participant can follow their personal performance history.</w:t>
+            </w:r>
+          </w:p>
+        </w:tc>
+        <w:tc>
+          <w:tcPr>
+            <w:tcW w:type="dxa" w:w="1100"/>
+            <w:tcBorders>
+              <w:top w:val="single" w:color="999999" w:sz="1"/>
+              <w:left w:val="single" w:color="999999" w:sz="1"/>
+              <w:bottom w:val="single" w:color="999999" w:sz="1"/>
+              <w:right w:val="single" w:color="999999" w:sz="1"/>
+            </w:tcBorders>
+            <w:tcMar>
+              <w:top w:type="dxa" w:w="60"/>
+              <w:left w:type="dxa" w:w="100"/>
+              <w:bottom w:type="dxa" w:w="60"/>
+              <w:right w:type="dxa" w:w="100"/>
+            </w:tcMar>
+          </w:tcPr>
+          <w:p>
+            <w:r>
+              <w:rPr>
+                <w:rFonts w:ascii="Arial" w:cs="Arial" w:eastAsia="Arial" w:hAnsi="Arial"/>
+                <w:b w:val="false"/>
+                <w:bCs w:val="false"/>
+                <w:color w:val="000000"/>
+                <w:sz w:val="18"/>
+                <w:szCs w:val="18"/>
+              </w:rPr>
+              <w:t xml:space="preserve">Any (logged in)</w:t>
+            </w:r>
+          </w:p>
+        </w:tc>
+        <w:tc>
+          <w:tcPr>
+            <w:tcW w:type="dxa" w:w="1660"/>
+            <w:tcBorders>
+              <w:top w:val="single" w:color="999999" w:sz="1"/>
+              <w:left w:val="single" w:color="999999" w:sz="1"/>
+              <w:bottom w:val="single" w:color="999999" w:sz="1"/>
+              <w:right w:val="single" w:color="999999" w:sz="1"/>
+            </w:tcBorders>
+            <w:tcMar>
+              <w:top w:type="dxa" w:w="60"/>
+              <w:left w:type="dxa" w:w="100"/>
+              <w:bottom w:type="dxa" w:w="60"/>
+              <w:right w:type="dxa" w:w="100"/>
+            </w:tcMar>
+          </w:tcPr>
+          <w:p>
+            <w:r>
+              <w:rPr>
+                <w:rFonts w:ascii="Arial" w:cs="Arial" w:eastAsia="Arial" w:hAnsi="Arial"/>
+                <w:b w:val="false"/>
+                <w:bCs w:val="false"/>
+                <w:color w:val="000000"/>
+                <w:sz w:val="18"/>
+                <w:szCs w:val="18"/>
+              </w:rPr>
+              <w:t xml:space="preserve">None</w:t>
+            </w:r>
+          </w:p>
+        </w:tc>
+        <w:tc>
+          <w:tcPr>
+            <w:tcW w:type="dxa" w:w="1700"/>
+            <w:tcBorders>
+              <w:top w:val="single" w:color="999999" w:sz="1"/>
+              <w:left w:val="single" w:color="999999" w:sz="1"/>
+              <w:bottom w:val="single" w:color="999999" w:sz="1"/>
+              <w:right w:val="single" w:color="999999" w:sz="1"/>
+            </w:tcBorders>
+            <w:tcMar>
+              <w:top w:type="dxa" w:w="60"/>
+              <w:left w:type="dxa" w:w="100"/>
+              <w:bottom w:type="dxa" w:w="60"/>
+              <w:right w:type="dxa" w:w="100"/>
+            </w:tcMar>
+          </w:tcPr>
+          <w:p>
+            <w:r>
+              <w:rPr>
+                <w:rFonts w:ascii="Arial" w:cs="Arial" w:eastAsia="Arial" w:hAnsi="Arial"/>
+                <w:b w:val="false"/>
+                <w:bCs w:val="false"/>
+                <w:color w:val="000000"/>
+                <w:sz w:val="18"/>
+                <w:szCs w:val="18"/>
+              </w:rPr>
+              <w:t xml:space="preserve">200 OK - returns an array of the user's results with event and category details. 401 Unauthorized - if not logged in.</w:t>
             </w:r>
           </w:p>
         </w:tc>
@@ -3784,7 +4330,7 @@
         <w:spacing w:after="120"/>
       </w:pPr>
       <w:r>
-        <w:t xml:space="preserve">- The system uses JWT tokens for authentication. The token is passed in the Authorization header as Bearer &lt;token&gt;.</w:t>
+        <w:t xml:space="preserve">- The system uses server-side sessions for authentication. When a user logs in, the server stores their user ID and role in the session and sends back a session cookie. Every authenticated request carries that cookie.</w:t>
       </w:r>
     </w:p>
     <w:p>
@@ -3840,7 +4386,7 @@
         <w:spacing w:after="120"/>
       </w:pPr>
       <w:r>
-        <w:t xml:space="preserve">Microsoft (2026) JWT bearer authentication in ASP.NET Core. Available at: https://learn.microsoft.com/en-us/aspnet/core/security/authentication/</w:t>
+        <w:t xml:space="preserve">Microsoft (2026) Session state in ASP.NET Core. Available at: https://learn.microsoft.com/en-us/aspnet/core/fundamentals/app-state</w:t>
       </w:r>
     </w:p>
     <w:p>

</xml_diff>